<commit_message>
details zu JCL, cherry-picking und rueckbau sync exception oder was das war
</commit_message>
<xml_diff>
--- a/docs/confluence/Naechste_Schritte.docx
+++ b/docs/confluence/Naechste_Schritte.docx
@@ -213,7 +213,7 @@
               <w:pStyle w:val="Compact"/>
             </w:pPr>
             <w:r>
-              <w:t xml:space="preserve">Zentrales Repository anlegen beziehungsweise lokalen Stand übernehmen</w:t>
+              <w:t xml:space="preserve">Zentrales Repository privat anlegen beziehungsweise lokalen Stand übernehmen</w:t>
             </w:r>
           </w:p>
         </w:tc>
@@ -244,7 +244,7 @@
               <w:pStyle w:val="Compact"/>
             </w:pPr>
             <w:r>
-              <w:t xml:space="preserve">Standardbranch und Freigabeprozess für die zentrale Automatisierung festlegen</w:t>
+              <w:t xml:space="preserve">Nur das zentrale Automatisierungsteam erhält direkten Lese- oder Schreibzugriff; Standardbranch und Freigabeprozess festlegen</w:t>
             </w:r>
           </w:p>
         </w:tc>
@@ -268,7 +268,7 @@
               <w:pStyle w:val="Compact"/>
             </w:pPr>
             <w:r>
-              <w:t xml:space="preserve">FI-Repository anlegen beziehungsweise lokalen Stand übernehmen</w:t>
+              <w:t xml:space="preserve">Privates FI-Repository anlegen beziehungsweise lokalen Stand übernehmen</w:t>
             </w:r>
           </w:p>
         </w:tc>
@@ -314,7 +314,7 @@
               <w:t xml:space="preserve"> </w:t>
             </w:r>
             <w:r>
-              <w:t xml:space="preserve">und dünne Workflows übernehmen</w:t>
+              <w:t xml:space="preserve">und dünne Workflows übernehmen; private Sichtbarkeit als Voraussetzung für den Aufruf des privaten zentralen Workflows bestätigen</w:t>
             </w:r>
           </w:p>
         </w:tc>
@@ -621,22 +621,7 @@
               <w:pStyle w:val="Compact"/>
             </w:pPr>
             <w:r>
-              <w:t xml:space="preserve">Nutzung durch</w:t>
-            </w:r>
-            <w:r>
-              <w:t xml:space="preserve"> </w:t>
-            </w:r>
-            <w:r>
-              <w:rPr>
-                <w:rStyle w:val="VerbatimChar"/>
-              </w:rPr>
-              <w:t xml:space="preserve">j517120/mtext-fi</w:t>
-            </w:r>
-            <w:r>
-              <w:t xml:space="preserve"> </w:t>
-            </w:r>
-            <w:r>
-              <w:t xml:space="preserve">und spätere Mandanten-Repositories erlauben</w:t>
+              <w:t xml:space="preserve">Ausschließlich den vorgesehenen Mandanten-Repositories die Ausführung der wiederverwendbaren Workflows erlauben; Text-Entwickler der Mandanten nicht als Repositorymitglieder aufnehmen</w:t>
             </w:r>
           </w:p>
         </w:tc>
@@ -683,6 +668,153 @@
             </w:pPr>
             <w:r>
               <w:t xml:space="preserve">Prüfen, ob die Enterprise-Freigabe den Checkout über beide Namespaces ermöglicht; falls ein Installation-Token erforderlich ist, den Workflowvertrag vor Aktivierung um dessen sichere Übergabe erweitern</w:t>
+            </w:r>
+          </w:p>
+        </w:tc>
+      </w:tr>
+      <w:tr>
+        <w:tc>
+          <w:tcPr/>
+          <w:p>
+            <w:pPr>
+              <w:pStyle w:val="Compact"/>
+            </w:pPr>
+            <w:r>
+              <w:t xml:space="preserve">offen</w:t>
+            </w:r>
+          </w:p>
+        </w:tc>
+        <w:tc>
+          <w:tcPr/>
+          <w:p>
+            <w:pPr>
+              <w:pStyle w:val="Compact"/>
+            </w:pPr>
+            <w:r>
+              <w:t xml:space="preserve">Mandantensichtbare Logs prüfen</w:t>
+            </w:r>
+          </w:p>
+        </w:tc>
+        <w:tc>
+          <w:tcPr/>
+          <w:p>
+            <w:pPr>
+              <w:pStyle w:val="Compact"/>
+            </w:pPr>
+            <w:r>
+              <w:t xml:space="preserve">Nichtproduktive Läufe in einem Mandanten-Repository</w:t>
+            </w:r>
+          </w:p>
+        </w:tc>
+        <w:tc>
+          <w:tcPr/>
+          <w:p>
+            <w:pPr>
+              <w:pStyle w:val="Compact"/>
+            </w:pPr>
+            <w:r>
+              <w:t xml:space="preserve">Sicherstellen, dass Logs keine vertraulichen zentralen Implementierungsdetails, Tokens, Secrets oder internen Dateiinhalte offenlegen</w:t>
+            </w:r>
+          </w:p>
+        </w:tc>
+      </w:tr>
+      <w:tr>
+        <w:tc>
+          <w:tcPr/>
+          <w:p>
+            <w:pPr>
+              <w:pStyle w:val="Compact"/>
+            </w:pPr>
+            <w:r>
+              <w:t xml:space="preserve">offen</w:t>
+            </w:r>
+          </w:p>
+        </w:tc>
+        <w:tc>
+          <w:tcPr/>
+          <w:p>
+            <w:pPr>
+              <w:pStyle w:val="Compact"/>
+            </w:pPr>
+            <w:r>
+              <w:t xml:space="preserve">Integrierten Git-Client der M/Text Workbench abnehmen</w:t>
+            </w:r>
+          </w:p>
+        </w:tc>
+        <w:tc>
+          <w:tcPr/>
+          <w:p>
+            <w:pPr>
+              <w:pStyle w:val="Compact"/>
+            </w:pPr>
+            <w:r>
+              <w:t xml:space="preserve">Repräsentativer Arbeitsplatz und</w:t>
+            </w:r>
+            <w:r>
+              <w:t xml:space="preserve"> </w:t>
+            </w:r>
+            <w:r>
+              <w:rPr>
+                <w:rStyle w:val="VerbatimChar"/>
+              </w:rPr>
+              <w:t xml:space="preserve">mtext-fi</w:t>
+            </w:r>
+          </w:p>
+        </w:tc>
+        <w:tc>
+          <w:tcPr/>
+          <w:p>
+            <w:pPr>
+              <w:pStyle w:val="Compact"/>
+            </w:pPr>
+            <w:r>
+              <w:t xml:space="preserve">Authentifizierung, Branchwechsel, Commit und Push auf einen Entwicklungsbranch praktisch prüfen und verständlich dokumentieren</w:t>
+            </w:r>
+          </w:p>
+        </w:tc>
+      </w:tr>
+      <w:tr>
+        <w:tc>
+          <w:tcPr/>
+          <w:p>
+            <w:pPr>
+              <w:pStyle w:val="Compact"/>
+            </w:pPr>
+            <w:r>
+              <w:t xml:space="preserve">offen</w:t>
+            </w:r>
+          </w:p>
+        </w:tc>
+        <w:tc>
+          <w:tcPr/>
+          <w:p>
+            <w:pPr>
+              <w:pStyle w:val="Compact"/>
+            </w:pPr>
+            <w:r>
+              <w:t xml:space="preserve">Zusätzlichen Git-Client für die Stufenweitergabe auswählen und bereitstellen</w:t>
+            </w:r>
+          </w:p>
+        </w:tc>
+        <w:tc>
+          <w:tcPr/>
+          <w:p>
+            <w:pPr>
+              <w:pStyle w:val="Compact"/>
+            </w:pPr>
+            <w:r>
+              <w:t xml:space="preserve">Arbeitsplätze der berechtigten Text-Entwickler und Release-Verantwortlichen</w:t>
+            </w:r>
+          </w:p>
+        </w:tc>
+        <w:tc>
+          <w:tcPr/>
+          <w:p>
+            <w:pPr>
+              <w:pStyle w:val="Compact"/>
+            </w:pPr>
+            <w:r>
+              <w:t xml:space="preserve">Produkt, Installation, Aktualisierung, Authentifizierung und Support festlegen; Cherry-Pick zwischen den Stufenbranches praktisch abnehmen</w:t>
             </w:r>
           </w:p>
         </w:tc>
@@ -928,7 +1060,7 @@
               <w:pStyle w:val="Compact"/>
             </w:pPr>
             <w:r>
-              <w:t xml:space="preserve">Berechtigten Mitarbeiterkreis je Mandant festlegen; Force-Pushes und Löschen verbieten</w:t>
+              <w:t xml:space="preserve">Kreis berechtigter Text-Entwickler je Mandant festlegen; Force-Pushes und Löschen verbieten</w:t>
             </w:r>
           </w:p>
         </w:tc>
@@ -1007,62 +1139,38 @@
               <w:pStyle w:val="Compact"/>
             </w:pPr>
             <w:r>
-              <w:t xml:space="preserve">GitHub Environment anlegen</w:t>
-            </w:r>
-          </w:p>
-        </w:tc>
-        <w:tc>
-          <w:tcPr/>
-          <w:p>
-            <w:pPr>
-              <w:pStyle w:val="Compact"/>
-            </w:pPr>
-            <w:r>
-              <w:t xml:space="preserve">Repository Settings → Environments</w:t>
-            </w:r>
-          </w:p>
-        </w:tc>
-        <w:tc>
-          <w:tcPr/>
-          <w:p>
-            <w:pPr>
-              <w:pStyle w:val="Compact"/>
-            </w:pPr>
-            <w:r>
-              <w:t xml:space="preserve">Gemeinsame Environments</w:t>
-            </w:r>
-            <w:r>
-              <w:t xml:space="preserve"> </w:t>
-            </w:r>
-            <w:r>
-              <w:rPr>
-                <w:rStyle w:val="VerbatimChar"/>
-              </w:rPr>
-              <w:t xml:space="preserve">Entwicklung</w:t>
-            </w:r>
-            <w:r>
-              <w:t xml:space="preserve">,</w:t>
-            </w:r>
-            <w:r>
-              <w:t xml:space="preserve"> </w:t>
-            </w:r>
-            <w:r>
-              <w:rPr>
-                <w:rStyle w:val="VerbatimChar"/>
-              </w:rPr>
-              <w:t xml:space="preserve">Abnahme</w:t>
-            </w:r>
-            <w:r>
-              <w:t xml:space="preserve">,</w:t>
-            </w:r>
-            <w:r>
-              <w:t xml:space="preserve"> </w:t>
-            </w:r>
-            <w:r>
-              <w:rPr>
-                <w:rStyle w:val="VerbatimChar"/>
-              </w:rPr>
-              <w:t xml:space="preserve">Bereitstellung</w:t>
+              <w:t xml:space="preserve">Zentrale Aufrufdateien im Mandanten-Repository schützen</w:t>
+            </w:r>
+          </w:p>
+        </w:tc>
+        <w:tc>
+          <w:tcPr/>
+          <w:p>
+            <w:pPr>
+              <w:pStyle w:val="Compact"/>
+            </w:pPr>
+            <w:r>
+              <w:t xml:space="preserve">Push-Ruleset für</w:t>
+            </w:r>
+            <w:r>
+              <w:t xml:space="preserve"> </w:t>
+            </w:r>
+            <w:r>
+              <w:rPr>
+                <w:rStyle w:val="VerbatimChar"/>
+              </w:rPr>
+              <w:t xml:space="preserve">.github/workflows/**/*</w:t>
+            </w:r>
+          </w:p>
+        </w:tc>
+        <w:tc>
+          <w:tcPr/>
+          <w:p>
+            <w:pPr>
+              <w:pStyle w:val="Compact"/>
+            </w:pPr>
+            <w:r>
+              <w:t xml:space="preserve">Änderungen durch Text-Entwickler des Mandanten auf allen Branches blockieren; Bypass nur für die zentralen Automatisierungsverantwortlichen vorsehen und auf GHES 3.20.4 praktisch prüfen</w:t>
             </w:r>
           </w:p>
         </w:tc>
@@ -1086,38 +1194,38 @@
               <w:pStyle w:val="Compact"/>
             </w:pPr>
             <w:r>
-              <w:t xml:space="preserve">Environment-Regeln setzen</w:t>
-            </w:r>
-          </w:p>
-        </w:tc>
-        <w:tc>
-          <w:tcPr/>
-          <w:p>
-            <w:pPr>
-              <w:pStyle w:val="Compact"/>
-            </w:pPr>
-            <w:r>
-              <w:t xml:space="preserve">Environments</w:t>
-            </w:r>
-          </w:p>
-        </w:tc>
-        <w:tc>
-          <w:tcPr/>
-          <w:p>
-            <w:pPr>
-              <w:pStyle w:val="Compact"/>
-            </w:pPr>
-            <w:r>
-              <w:t xml:space="preserve">Keine zusätzliche Freigabe für Entwicklung und Abnahme; manuelle Freigabe vor Mainframe-Übergabe in</w:t>
-            </w:r>
-            <w:r>
-              <w:t xml:space="preserve"> </w:t>
-            </w:r>
-            <w:r>
-              <w:rPr>
-                <w:rStyle w:val="VerbatimChar"/>
-              </w:rPr>
-              <w:t xml:space="preserve">Bereitstellung</w:t>
+              <w:t xml:space="preserve">Mandantenkonfiguration gegen normale Ressourcen-Pushes schützen</w:t>
+            </w:r>
+          </w:p>
+        </w:tc>
+        <w:tc>
+          <w:tcPr/>
+          <w:p>
+            <w:pPr>
+              <w:pStyle w:val="Compact"/>
+            </w:pPr>
+            <w:r>
+              <w:t xml:space="preserve">Push-Ruleset für</w:t>
+            </w:r>
+            <w:r>
+              <w:t xml:space="preserve"> </w:t>
+            </w:r>
+            <w:r>
+              <w:rPr>
+                <w:rStyle w:val="VerbatimChar"/>
+              </w:rPr>
+              <w:t xml:space="preserve">config/mandant.json</w:t>
+            </w:r>
+          </w:p>
+        </w:tc>
+        <w:tc>
+          <w:tcPr/>
+          <w:p>
+            <w:pPr>
+              <w:pStyle w:val="Compact"/>
+            </w:pPr>
+            <w:r>
+              <w:t xml:space="preserve">Änderungen nur dem ausdrücklich benannten technischen Verantwortlichenkreis erlauben; normale Workbench-Pushes dürfen die Datei nicht verändern</w:t>
             </w:r>
           </w:p>
         </w:tc>
@@ -1141,38 +1249,38 @@
               <w:pStyle w:val="Compact"/>
             </w:pPr>
             <w:r>
-              <w:t xml:space="preserve">Zulässige Deploymentbranches eintragen</w:t>
-            </w:r>
-          </w:p>
-        </w:tc>
-        <w:tc>
-          <w:tcPr/>
-          <w:p>
-            <w:pPr>
-              <w:pStyle w:val="Compact"/>
-            </w:pPr>
-            <w:r>
-              <w:t xml:space="preserve">Environments</w:t>
-            </w:r>
-          </w:p>
-        </w:tc>
-        <w:tc>
-          <w:tcPr/>
-          <w:p>
-            <w:pPr>
-              <w:pStyle w:val="Compact"/>
-            </w:pPr>
-            <w:r>
-              <w:t xml:space="preserve">Generische Muster</w:t>
-            </w:r>
-            <w:r>
-              <w:t xml:space="preserve"> </w:t>
-            </w:r>
-            <w:r>
-              <w:rPr>
-                <w:rStyle w:val="VerbatimChar"/>
-              </w:rPr>
-              <w:t xml:space="preserve">R*/Entwicklung</w:t>
+              <w:t xml:space="preserve">GitHub Environment anlegen</w:t>
+            </w:r>
+          </w:p>
+        </w:tc>
+        <w:tc>
+          <w:tcPr/>
+          <w:p>
+            <w:pPr>
+              <w:pStyle w:val="Compact"/>
+            </w:pPr>
+            <w:r>
+              <w:t xml:space="preserve">Repository Settings → Environments</w:t>
+            </w:r>
+          </w:p>
+        </w:tc>
+        <w:tc>
+          <w:tcPr/>
+          <w:p>
+            <w:pPr>
+              <w:pStyle w:val="Compact"/>
+            </w:pPr>
+            <w:r>
+              <w:t xml:space="preserve">Gemeinsame Environments</w:t>
+            </w:r>
+            <w:r>
+              <w:t xml:space="preserve"> </w:t>
+            </w:r>
+            <w:r>
+              <w:rPr>
+                <w:rStyle w:val="VerbatimChar"/>
+              </w:rPr>
+              <w:t xml:space="preserve">Entwicklung</w:t>
             </w:r>
             <w:r>
               <w:t xml:space="preserve">,</w:t>
@@ -1184,28 +1292,19 @@
               <w:rPr>
                 <w:rStyle w:val="VerbatimChar"/>
               </w:rPr>
-              <w:t xml:space="preserve">R*/Abnahme</w:t>
-            </w:r>
-            <w:r>
-              <w:t xml:space="preserve"> </w:t>
-            </w:r>
-            <w:r>
-              <w:t xml:space="preserve">und für die Freigabe</w:t>
-            </w:r>
-            <w:r>
-              <w:t xml:space="preserve"> </w:t>
-            </w:r>
-            <w:r>
-              <w:rPr>
-                <w:rStyle w:val="VerbatimChar"/>
-              </w:rPr>
-              <w:t xml:space="preserve">R*/Bereitstellung</w:t>
-            </w:r>
-            <w:r>
-              <w:t xml:space="preserve"> </w:t>
-            </w:r>
-            <w:r>
-              <w:t xml:space="preserve">verwenden; die aktive Linie wird zentral validiert</w:t>
+              <w:t xml:space="preserve">Abnahme</w:t>
+            </w:r>
+            <w:r>
+              <w:t xml:space="preserve">,</w:t>
+            </w:r>
+            <w:r>
+              <w:t xml:space="preserve"> </w:t>
+            </w:r>
+            <w:r>
+              <w:rPr>
+                <w:rStyle w:val="VerbatimChar"/>
+              </w:rPr>
+              <w:t xml:space="preserve">Bereitstellung</w:t>
             </w:r>
           </w:p>
         </w:tc>
@@ -1229,38 +1328,38 @@
               <w:pStyle w:val="Compact"/>
             </w:pPr>
             <w:r>
-              <w:t xml:space="preserve">Erstellung von Release-Tags begrenzen</w:t>
-            </w:r>
-          </w:p>
-        </w:tc>
-        <w:tc>
-          <w:tcPr/>
-          <w:p>
-            <w:pPr>
-              <w:pStyle w:val="Compact"/>
-            </w:pPr>
-            <w:r>
-              <w:t xml:space="preserve">Tag-Ruleset für</w:t>
-            </w:r>
-            <w:r>
-              <w:t xml:space="preserve"> </w:t>
-            </w:r>
-            <w:r>
-              <w:rPr>
-                <w:rStyle w:val="VerbatimChar"/>
-              </w:rPr>
-              <w:t xml:space="preserve">R[0-9][0-9][0-9].[0-9][0-9][0-9]</w:t>
-            </w:r>
-          </w:p>
-        </w:tc>
-        <w:tc>
-          <w:tcPr/>
-          <w:p>
-            <w:pPr>
-              <w:pStyle w:val="Compact"/>
-            </w:pPr>
-            <w:r>
-              <w:t xml:space="preserve">Nur das je Mandant benannte Release-Team darf neue passende Tags anlegen</w:t>
+              <w:t xml:space="preserve">Environment-Regeln setzen</w:t>
+            </w:r>
+          </w:p>
+        </w:tc>
+        <w:tc>
+          <w:tcPr/>
+          <w:p>
+            <w:pPr>
+              <w:pStyle w:val="Compact"/>
+            </w:pPr>
+            <w:r>
+              <w:t xml:space="preserve">Environments</w:t>
+            </w:r>
+          </w:p>
+        </w:tc>
+        <w:tc>
+          <w:tcPr/>
+          <w:p>
+            <w:pPr>
+              <w:pStyle w:val="Compact"/>
+            </w:pPr>
+            <w:r>
+              <w:t xml:space="preserve">Keine zusätzliche Freigabe für Entwicklung und Abnahme; manuelle Freigabe vor Mainframe-Übergabe in</w:t>
+            </w:r>
+            <w:r>
+              <w:t xml:space="preserve"> </w:t>
+            </w:r>
+            <w:r>
+              <w:rPr>
+                <w:rStyle w:val="VerbatimChar"/>
+              </w:rPr>
+              <w:t xml:space="preserve">Bereitstellung</w:t>
             </w:r>
           </w:p>
         </w:tc>
@@ -1284,6 +1383,149 @@
               <w:pStyle w:val="Compact"/>
             </w:pPr>
             <w:r>
+              <w:t xml:space="preserve">Zulässige Deploymentbranches eintragen</w:t>
+            </w:r>
+          </w:p>
+        </w:tc>
+        <w:tc>
+          <w:tcPr/>
+          <w:p>
+            <w:pPr>
+              <w:pStyle w:val="Compact"/>
+            </w:pPr>
+            <w:r>
+              <w:t xml:space="preserve">Environments</w:t>
+            </w:r>
+          </w:p>
+        </w:tc>
+        <w:tc>
+          <w:tcPr/>
+          <w:p>
+            <w:pPr>
+              <w:pStyle w:val="Compact"/>
+            </w:pPr>
+            <w:r>
+              <w:t xml:space="preserve">Generische Muster</w:t>
+            </w:r>
+            <w:r>
+              <w:t xml:space="preserve"> </w:t>
+            </w:r>
+            <w:r>
+              <w:rPr>
+                <w:rStyle w:val="VerbatimChar"/>
+              </w:rPr>
+              <w:t xml:space="preserve">R*/Entwicklung</w:t>
+            </w:r>
+            <w:r>
+              <w:t xml:space="preserve">,</w:t>
+            </w:r>
+            <w:r>
+              <w:t xml:space="preserve"> </w:t>
+            </w:r>
+            <w:r>
+              <w:rPr>
+                <w:rStyle w:val="VerbatimChar"/>
+              </w:rPr>
+              <w:t xml:space="preserve">R*/Abnahme</w:t>
+            </w:r>
+            <w:r>
+              <w:t xml:space="preserve"> </w:t>
+            </w:r>
+            <w:r>
+              <w:t xml:space="preserve">und für die Freigabe</w:t>
+            </w:r>
+            <w:r>
+              <w:t xml:space="preserve"> </w:t>
+            </w:r>
+            <w:r>
+              <w:rPr>
+                <w:rStyle w:val="VerbatimChar"/>
+              </w:rPr>
+              <w:t xml:space="preserve">R*/Bereitstellung</w:t>
+            </w:r>
+            <w:r>
+              <w:t xml:space="preserve"> </w:t>
+            </w:r>
+            <w:r>
+              <w:t xml:space="preserve">verwenden; die aktive Linie wird zentral validiert</w:t>
+            </w:r>
+          </w:p>
+        </w:tc>
+      </w:tr>
+      <w:tr>
+        <w:tc>
+          <w:tcPr/>
+          <w:p>
+            <w:pPr>
+              <w:pStyle w:val="Compact"/>
+            </w:pPr>
+            <w:r>
+              <w:t xml:space="preserve">offen</w:t>
+            </w:r>
+          </w:p>
+        </w:tc>
+        <w:tc>
+          <w:tcPr/>
+          <w:p>
+            <w:pPr>
+              <w:pStyle w:val="Compact"/>
+            </w:pPr>
+            <w:r>
+              <w:t xml:space="preserve">Erstellung von Release-Tags begrenzen</w:t>
+            </w:r>
+          </w:p>
+        </w:tc>
+        <w:tc>
+          <w:tcPr/>
+          <w:p>
+            <w:pPr>
+              <w:pStyle w:val="Compact"/>
+            </w:pPr>
+            <w:r>
+              <w:t xml:space="preserve">Tag-Ruleset für</w:t>
+            </w:r>
+            <w:r>
+              <w:t xml:space="preserve"> </w:t>
+            </w:r>
+            <w:r>
+              <w:rPr>
+                <w:rStyle w:val="VerbatimChar"/>
+              </w:rPr>
+              <w:t xml:space="preserve">R[0-9][0-9][0-9].[0-9][0-9][0-9]</w:t>
+            </w:r>
+          </w:p>
+        </w:tc>
+        <w:tc>
+          <w:tcPr/>
+          <w:p>
+            <w:pPr>
+              <w:pStyle w:val="Compact"/>
+            </w:pPr>
+            <w:r>
+              <w:t xml:space="preserve">Nur das je Mandant benannte Release-Team darf neue passende Tags anlegen</w:t>
+            </w:r>
+          </w:p>
+        </w:tc>
+      </w:tr>
+      <w:tr>
+        <w:tc>
+          <w:tcPr/>
+          <w:p>
+            <w:pPr>
+              <w:pStyle w:val="Compact"/>
+            </w:pPr>
+            <w:r>
+              <w:t xml:space="preserve">offen</w:t>
+            </w:r>
+          </w:p>
+        </w:tc>
+        <w:tc>
+          <w:tcPr/>
+          <w:p>
+            <w:pPr>
+              <w:pStyle w:val="Compact"/>
+            </w:pPr>
+            <w:r>
               <w:t xml:space="preserve">Release-Tags unveränderlich schützen</w:t>
             </w:r>
           </w:p>
@@ -1307,6 +1549,98 @@
             </w:pPr>
             <w:r>
               <w:t xml:space="preserve">Updates, Force-Pushes und Löschungen ohne regulären Bypass verbieten; einen gegebenenfalls notwendigen administrativen Notfallweg separat festlegen</w:t>
+            </w:r>
+          </w:p>
+        </w:tc>
+      </w:tr>
+      <w:tr>
+        <w:tc>
+          <w:tcPr/>
+          <w:p>
+            <w:pPr>
+              <w:pStyle w:val="Compact"/>
+            </w:pPr>
+            <w:r>
+              <w:t xml:space="preserve">offen</w:t>
+            </w:r>
+          </w:p>
+        </w:tc>
+        <w:tc>
+          <w:tcPr/>
+          <w:p>
+            <w:pPr>
+              <w:pStyle w:val="Compact"/>
+            </w:pPr>
+            <w:r>
+              <w:t xml:space="preserve">Cherry-Pick-Bedienweg für Abnahme und Bereitstellung festlegen</w:t>
+            </w:r>
+          </w:p>
+        </w:tc>
+        <w:tc>
+          <w:tcPr/>
+          <w:p>
+            <w:pPr>
+              <w:pStyle w:val="Compact"/>
+            </w:pPr>
+            <w:r>
+              <w:t xml:space="preserve">Zusätzlicher Git-Client und Pilotprozess je Mandant</w:t>
+            </w:r>
+          </w:p>
+        </w:tc>
+        <w:tc>
+          <w:tcPr/>
+          <w:p>
+            <w:pPr>
+              <w:pStyle w:val="Compact"/>
+            </w:pPr>
+            <w:r>
+              <w:t xml:space="preserve">Auswahl nach SHA, Aktualisierung des Zielbranches, Dokumentation der vollständigen Quell-SHA im neuen Ziel-Commit, Reihenfolge mehrerer Commits, Konfliktbehandlung, Prüfung und Push verständlich dokumentieren; die GitHub-Weboberfläche allein unterstützt diesen Ablauf nicht</w:t>
+            </w:r>
+          </w:p>
+        </w:tc>
+      </w:tr>
+      <w:tr>
+        <w:tc>
+          <w:tcPr/>
+          <w:p>
+            <w:pPr>
+              <w:pStyle w:val="Compact"/>
+            </w:pPr>
+            <w:r>
+              <w:t xml:space="preserve">offen</w:t>
+            </w:r>
+          </w:p>
+        </w:tc>
+        <w:tc>
+          <w:tcPr/>
+          <w:p>
+            <w:pPr>
+              <w:pStyle w:val="Compact"/>
+            </w:pPr>
+            <w:r>
+              <w:t xml:space="preserve">Release-Tag in GitHub praktisch prüfen</w:t>
+            </w:r>
+          </w:p>
+        </w:tc>
+        <w:tc>
+          <w:tcPr/>
+          <w:p>
+            <w:pPr>
+              <w:pStyle w:val="Compact"/>
+            </w:pPr>
+            <w:r>
+              <w:t xml:space="preserve">GitHub-Weboberfläche und nichtproduktiver Bereitstellungsbranch</w:t>
+            </w:r>
+          </w:p>
+        </w:tc>
+        <w:tc>
+          <w:tcPr/>
+          <w:p>
+            <w:pPr>
+              <w:pStyle w:val="Compact"/>
+            </w:pPr>
+            <w:r>
+              <w:t xml:space="preserve">Tag auf dem bestätigten Bereitstellungsstand anlegen, Ruleset-Wirkung und einmaligen Start des Release-Workflows prüfen</w:t>
             </w:r>
           </w:p>
         </w:tc>
@@ -2524,6 +2858,82 @@
               <w:pStyle w:val="Compact"/>
             </w:pPr>
             <w:r>
+              <w:t xml:space="preserve">bestätigt</w:t>
+            </w:r>
+          </w:p>
+        </w:tc>
+        <w:tc>
+          <w:tcPr/>
+          <w:p>
+            <w:pPr>
+              <w:pStyle w:val="Compact"/>
+            </w:pPr>
+            <w:r>
+              <w:t xml:space="preserve">Historischen JCL-Eingabevertrag fachlich bestätigen</w:t>
+            </w:r>
+          </w:p>
+        </w:tc>
+        <w:tc>
+          <w:tcPr/>
+          <w:p>
+            <w:pPr>
+              <w:pStyle w:val="Compact"/>
+            </w:pPr>
+            <w:r>
+              <w:t xml:space="preserve">Bestehendes Verfahren und versioniertes JCL-Template</w:t>
+            </w:r>
+          </w:p>
+        </w:tc>
+        <w:tc>
+          <w:tcPr/>
+          <w:p>
+            <w:pPr>
+              <w:pStyle w:val="Compact"/>
+            </w:pPr>
+            <w:r>
+              <w:t xml:space="preserve">Der mandantenspezifische Zielcode wird wie bisher über genau einen vorhandenen JCL-Platzhalter eingesetzt; der getrennte zentrale Test-/Produktionswert ist auf</w:t>
+            </w:r>
+            <w:r>
+              <w:t xml:space="preserve"> </w:t>
+            </w:r>
+            <w:r>
+              <w:rPr>
+                <w:rStyle w:val="VerbatimChar"/>
+              </w:rPr>
+              <w:t xml:space="preserve">T</w:t>
+            </w:r>
+            <w:r>
+              <w:t xml:space="preserve"> </w:t>
+            </w:r>
+            <w:r>
+              <w:t xml:space="preserve">und</w:t>
+            </w:r>
+            <w:r>
+              <w:t xml:space="preserve"> </w:t>
+            </w:r>
+            <w:r>
+              <w:rPr>
+                <w:rStyle w:val="VerbatimChar"/>
+              </w:rPr>
+              <w:t xml:space="preserve">P</w:t>
+            </w:r>
+            <w:r>
+              <w:t xml:space="preserve"> </w:t>
+            </w:r>
+            <w:r>
+              <w:t xml:space="preserve">begrenzt; ein zusätzlicher Zielparameter wird nicht eingeführt</w:t>
+            </w:r>
+          </w:p>
+        </w:tc>
+      </w:tr>
+      <w:tr>
+        <w:tc>
+          <w:tcPr/>
+          <w:p>
+            <w:pPr>
+              <w:pStyle w:val="Compact"/>
+            </w:pPr>
+            <w:r>
               <w:t xml:space="preserve">offen</w:t>
             </w:r>
           </w:p>
@@ -2935,7 +3345,7 @@
               <w:pStyle w:val="Compact"/>
             </w:pPr>
             <w:r>
-              <w:t xml:space="preserve">Repositoryinhalt, Projekt-Allowlist und Paketcode getrennt dokumentieren; nicht allein aus einer globalen Projektliste ableiten</w:t>
+              <w:t xml:space="preserve">Repositoryinhalt, Projekt-Allowlist und historisch festgelegte Lieferdateinamen getrennt dokumentieren; nicht allein aus einer globalen Projektliste ableiten</w:t>
             </w:r>
           </w:p>
         </w:tc>
@@ -4133,7 +4543,13 @@
         </w:numPr>
       </w:pPr>
       <w:r>
-        <w:t xml:space="preserve">Assignment und Level bei betrieblichen Änderungen ausschließlich in</w:t>
+        <w:t xml:space="preserve">Mandantenspezifische technische Übergabewerte bei betrieblichen Änderungen</w:t>
+      </w:r>
+      <w:r>
+        <w:t xml:space="preserve"> </w:t>
+      </w:r>
+      <w:r>
+        <w:t xml:space="preserve">ausschließlich in</w:t>
       </w:r>
       <w:r>
         <w:t xml:space="preserve"> </w:t>
@@ -4148,7 +4564,13 @@
         <w:t xml:space="preserve"> </w:t>
       </w:r>
       <w:r>
-        <w:t xml:space="preserve">des betroffenen Mandanten anpassen.</w:t>
+        <w:t xml:space="preserve">des betroffenen Mandanten anpassen;</w:t>
+      </w:r>
+      <w:r>
+        <w:t xml:space="preserve"> </w:t>
+      </w:r>
+      <w:r>
+        <w:t xml:space="preserve">die zentral abgeleiteten Lieferdateinamen sind dort nicht konfigurierbar.</w:t>
       </w:r>
     </w:p>
     <w:p>
@@ -4248,42 +4670,6 @@
       </w:r>
       <w:r>
         <w:t xml:space="preserve">;</w:t>
-      </w:r>
-    </w:p>
-    <w:p>
-      <w:pPr>
-        <w:pStyle w:val="Compact"/>
-        <w:numPr>
-          <w:ilvl w:val="0"/>
-          <w:numId w:val="1004"/>
-        </w:numPr>
-      </w:pPr>
-      <w:r>
-        <w:t xml:space="preserve">bei entsprechendem Ergebnis der Pilotphase kurzlebiger Auswahlbranch mit</w:t>
-      </w:r>
-      <w:r>
-        <w:t xml:space="preserve"> </w:t>
-      </w:r>
-      <w:r>
-        <w:t xml:space="preserve">normalem Pull Request nach</w:t>
-      </w:r>
-      <w:r>
-        <w:t xml:space="preserve"> </w:t>
-      </w:r>
-      <w:r>
-        <w:rPr>
-          <w:rStyle w:val="VerbatimChar"/>
-        </w:rPr>
-        <w:t xml:space="preserve">Rnnn/Bereitstellung</w:t>
-      </w:r>
-      <w:r>
-        <w:t xml:space="preserve">, ohne eigenen</w:t>
-      </w:r>
-      <w:r>
-        <w:t xml:space="preserve"> </w:t>
-      </w:r>
-      <w:r>
-        <w:t xml:space="preserve">zusätzlichen Workflow für diesen Auswahlbranch;</w:t>
       </w:r>
     </w:p>
     <w:p>

</xml_diff>